<commit_message>
Progress on the TofuTD docs
</commit_message>
<xml_diff>
--- a/docs/Tofu Tower Defence.docx
+++ b/docs/Tofu Tower Defence.docx
@@ -984,6 +984,15 @@
     </w:sdt>
     <w:sdt>
       <w:sdtPr>
+        <w:rPr>
+          <w:rFonts w:eastAsiaTheme="minorHAnsi" w:cs="Times New Roman"/>
+          <w:color w:val="auto"/>
+          <w:kern w:val="2"/>
+          <w:sz w:val="22"/>
+          <w:szCs w:val="22"/>
+          <w:lang w:val="en-CA"/>
+          <w14:ligatures w14:val="standardContextual"/>
+        </w:rPr>
         <w:id w:val="-1337684794"/>
         <w:docPartObj>
           <w:docPartGallery w:val="Table of Contents"/>
@@ -992,16 +1001,9 @@
       </w:sdtPr>
       <w:sdtEndPr>
         <w:rPr>
-          <w:rFonts w:eastAsiaTheme="minorHAnsi" w:cs="Times New Roman"/>
           <w:b/>
           <w:bCs/>
           <w:noProof/>
-          <w:color w:val="auto"/>
-          <w:kern w:val="2"/>
-          <w:sz w:val="22"/>
-          <w:szCs w:val="22"/>
-          <w:lang w:val="en-CA"/>
-          <w14:ligatures w14:val="standardContextual"/>
         </w:rPr>
       </w:sdtEndPr>
       <w:sdtContent>
@@ -1020,7 +1022,11 @@
               <w:tab w:val="right" w:leader="dot" w:pos="9350"/>
             </w:tabs>
             <w:rPr>
+              <w:rFonts w:eastAsiaTheme="minorEastAsia" w:cstheme="minorBidi"/>
               <w:noProof/>
+              <w:sz w:val="24"/>
+              <w:szCs w:val="24"/>
+              <w:lang w:val="en-US"/>
             </w:rPr>
           </w:pPr>
           <w:r>
@@ -1032,7 +1038,7 @@
           <w:r>
             <w:fldChar w:fldCharType="separate"/>
           </w:r>
-          <w:hyperlink w:anchor="_Toc185890044" w:history="1">
+          <w:hyperlink w:anchor="_Toc186050673" w:history="1">
             <w:r>
               <w:rPr>
                 <w:rStyle w:val="Hyperlink"/>
@@ -1059,7 +1065,7 @@
                 <w:noProof/>
                 <w:webHidden/>
               </w:rPr>
-              <w:instrText xml:space="preserve"> PAGEREF _Toc185890044 \h </w:instrText>
+              <w:instrText xml:space="preserve"> PAGEREF _Toc186050673 \h </w:instrText>
             </w:r>
             <w:r>
               <w:rPr>
@@ -1097,16 +1103,20 @@
               <w:tab w:val="right" w:leader="dot" w:pos="9350"/>
             </w:tabs>
             <w:rPr>
+              <w:rFonts w:eastAsiaTheme="minorEastAsia" w:cstheme="minorBidi"/>
               <w:noProof/>
+              <w:sz w:val="24"/>
+              <w:szCs w:val="24"/>
+              <w:lang w:val="en-US"/>
             </w:rPr>
           </w:pPr>
-          <w:hyperlink w:anchor="_Toc185890045" w:history="1">
+          <w:hyperlink w:anchor="_Toc186050674" w:history="1">
             <w:r>
               <w:rPr>
                 <w:rStyle w:val="Hyperlink"/>
                 <w:noProof/>
               </w:rPr>
-              <w:t>Game</w:t>
+              <w:t>Terminology</w:t>
             </w:r>
             <w:r>
               <w:rPr>
@@ -1127,7 +1137,7 @@
                 <w:noProof/>
                 <w:webHidden/>
               </w:rPr>
-              <w:instrText xml:space="preserve"> PAGEREF _Toc185890045 \h </w:instrText>
+              <w:instrText xml:space="preserve"> PAGEREF _Toc186050674 \h </w:instrText>
             </w:r>
             <w:r>
               <w:rPr>
@@ -1148,6 +1158,268 @@
                 <w:webHidden/>
               </w:rPr>
               <w:t>2</w:t>
+            </w:r>
+            <w:r>
+              <w:rPr>
+                <w:noProof/>
+                <w:webHidden/>
+              </w:rPr>
+              <w:fldChar w:fldCharType="end"/>
+            </w:r>
+          </w:hyperlink>
+        </w:p>
+        <w:p>
+          <w:pPr>
+            <w:pStyle w:val="TOC1"/>
+            <w:tabs>
+              <w:tab w:val="right" w:leader="dot" w:pos="9350"/>
+            </w:tabs>
+            <w:rPr>
+              <w:rFonts w:eastAsiaTheme="minorEastAsia" w:cstheme="minorBidi"/>
+              <w:noProof/>
+              <w:sz w:val="24"/>
+              <w:szCs w:val="24"/>
+              <w:lang w:val="en-US"/>
+            </w:rPr>
+          </w:pPr>
+          <w:r>
+            <w:rPr>
+              <w:noProof/>
+            </w:rPr>
+            <w:fldChar w:fldCharType="begin"/>
+          </w:r>
+          <w:r>
+            <w:rPr>
+              <w:noProof/>
+            </w:rPr>
+            <w:instrText xml:space="preserve"> =  \* MERGEFORMAT </w:instrText>
+          </w:r>
+          <w:r>
+            <w:rPr>
+              <w:noProof/>
+            </w:rPr>
+            <w:fldChar w:fldCharType="separate"/>
+          </w:r>
+          <w:r>
+            <w:rPr>
+              <w:b/>
+              <w:noProof/>
+            </w:rPr>
+            <w:t>!Unexpected End of Formula</w:t>
+          </w:r>
+          <w:r>
+            <w:rPr>
+              <w:noProof/>
+            </w:rPr>
+            <w:fldChar w:fldCharType="end"/>
+          </w:r>
+        </w:p>
+        <w:p>
+          <w:pPr>
+            <w:pStyle w:val="TOC2"/>
+            <w:tabs>
+              <w:tab w:val="right" w:leader="dot" w:pos="9350"/>
+            </w:tabs>
+            <w:rPr>
+              <w:rFonts w:eastAsiaTheme="minorEastAsia" w:cstheme="minorBidi"/>
+              <w:noProof/>
+              <w:sz w:val="24"/>
+              <w:szCs w:val="24"/>
+              <w:lang w:val="en-US"/>
+            </w:rPr>
+          </w:pPr>
+          <w:hyperlink w:anchor="_Toc186050676" w:history="1">
+            <w:r>
+              <w:rPr>
+                <w:rStyle w:val="Hyperlink"/>
+                <w:noProof/>
+              </w:rPr>
+              <w:t>Overview</w:t>
+            </w:r>
+            <w:r>
+              <w:rPr>
+                <w:noProof/>
+                <w:webHidden/>
+              </w:rPr>
+              <w:tab/>
+            </w:r>
+            <w:r>
+              <w:rPr>
+                <w:noProof/>
+                <w:webHidden/>
+              </w:rPr>
+              <w:fldChar w:fldCharType="begin"/>
+            </w:r>
+            <w:r>
+              <w:rPr>
+                <w:noProof/>
+                <w:webHidden/>
+              </w:rPr>
+              <w:instrText xml:space="preserve"> PAGEREF _Toc186050676 \h </w:instrText>
+            </w:r>
+            <w:r>
+              <w:rPr>
+                <w:noProof/>
+                <w:webHidden/>
+              </w:rPr>
+            </w:r>
+            <w:r>
+              <w:rPr>
+                <w:noProof/>
+                <w:webHidden/>
+              </w:rPr>
+              <w:fldChar w:fldCharType="separate"/>
+            </w:r>
+            <w:r>
+              <w:rPr>
+                <w:noProof/>
+                <w:webHidden/>
+              </w:rPr>
+              <w:t>2</w:t>
+            </w:r>
+            <w:r>
+              <w:rPr>
+                <w:noProof/>
+                <w:webHidden/>
+              </w:rPr>
+              <w:fldChar w:fldCharType="end"/>
+            </w:r>
+          </w:hyperlink>
+        </w:p>
+        <w:p>
+          <w:pPr>
+            <w:pStyle w:val="TOC2"/>
+            <w:tabs>
+              <w:tab w:val="right" w:leader="dot" w:pos="9350"/>
+            </w:tabs>
+            <w:rPr>
+              <w:rFonts w:eastAsiaTheme="minorEastAsia" w:cstheme="minorBidi"/>
+              <w:noProof/>
+              <w:sz w:val="24"/>
+              <w:szCs w:val="24"/>
+              <w:lang w:val="en-US"/>
+            </w:rPr>
+          </w:pPr>
+          <w:hyperlink w:anchor="_Toc186050677" w:history="1">
+            <w:r>
+              <w:rPr>
+                <w:rStyle w:val="Hyperlink"/>
+                <w:noProof/>
+              </w:rPr>
+              <w:t>Gameplay</w:t>
+            </w:r>
+            <w:r>
+              <w:rPr>
+                <w:noProof/>
+                <w:webHidden/>
+              </w:rPr>
+              <w:tab/>
+            </w:r>
+            <w:r>
+              <w:rPr>
+                <w:noProof/>
+                <w:webHidden/>
+              </w:rPr>
+              <w:fldChar w:fldCharType="begin"/>
+            </w:r>
+            <w:r>
+              <w:rPr>
+                <w:noProof/>
+                <w:webHidden/>
+              </w:rPr>
+              <w:instrText xml:space="preserve"> PAGEREF _Toc186050677 \h </w:instrText>
+            </w:r>
+            <w:r>
+              <w:rPr>
+                <w:noProof/>
+                <w:webHidden/>
+              </w:rPr>
+            </w:r>
+            <w:r>
+              <w:rPr>
+                <w:noProof/>
+                <w:webHidden/>
+              </w:rPr>
+              <w:fldChar w:fldCharType="separate"/>
+            </w:r>
+            <w:r>
+              <w:rPr>
+                <w:noProof/>
+                <w:webHidden/>
+              </w:rPr>
+              <w:t>3</w:t>
+            </w:r>
+            <w:r>
+              <w:rPr>
+                <w:noProof/>
+                <w:webHidden/>
+              </w:rPr>
+              <w:fldChar w:fldCharType="end"/>
+            </w:r>
+          </w:hyperlink>
+        </w:p>
+        <w:p>
+          <w:pPr>
+            <w:pStyle w:val="TOC2"/>
+            <w:tabs>
+              <w:tab w:val="right" w:leader="dot" w:pos="9350"/>
+            </w:tabs>
+            <w:rPr>
+              <w:rFonts w:eastAsiaTheme="minorEastAsia" w:cstheme="minorBidi"/>
+              <w:noProof/>
+              <w:sz w:val="24"/>
+              <w:szCs w:val="24"/>
+              <w:lang w:val="en-US"/>
+            </w:rPr>
+          </w:pPr>
+          <w:hyperlink w:anchor="_Toc186050678" w:history="1">
+            <w:r>
+              <w:rPr>
+                <w:rStyle w:val="Hyperlink"/>
+                <w:noProof/>
+              </w:rPr>
+              <w:t>Game State Flow Chart</w:t>
+            </w:r>
+            <w:r>
+              <w:rPr>
+                <w:noProof/>
+                <w:webHidden/>
+              </w:rPr>
+              <w:tab/>
+            </w:r>
+            <w:r>
+              <w:rPr>
+                <w:noProof/>
+                <w:webHidden/>
+              </w:rPr>
+              <w:fldChar w:fldCharType="begin"/>
+            </w:r>
+            <w:r>
+              <w:rPr>
+                <w:noProof/>
+                <w:webHidden/>
+              </w:rPr>
+              <w:instrText xml:space="preserve"> PAGEREF _Toc186050678 \h </w:instrText>
+            </w:r>
+            <w:r>
+              <w:rPr>
+                <w:noProof/>
+                <w:webHidden/>
+              </w:rPr>
+            </w:r>
+            <w:r>
+              <w:rPr>
+                <w:noProof/>
+                <w:webHidden/>
+              </w:rPr>
+              <w:fldChar w:fldCharType="separate"/>
+            </w:r>
+            <w:r>
+              <w:rPr>
+                <w:noProof/>
+                <w:webHidden/>
+              </w:rPr>
+              <w:t>4</w:t>
             </w:r>
             <w:r>
               <w:rPr>
@@ -1187,7 +1459,7 @@
       <w:pPr>
         <w:pStyle w:val="Heading1"/>
       </w:pPr>
-      <w:bookmarkStart w:id="0" w:name="_Toc185890044"/>
+      <w:bookmarkStart w:id="0" w:name="_Toc186050673"/>
       <w:r>
         <w:lastRenderedPageBreak/>
         <w:t>Preamble</w:t>
@@ -1212,9 +1484,11 @@
       <w:pPr>
         <w:pStyle w:val="Heading1"/>
       </w:pPr>
+      <w:bookmarkStart w:id="1" w:name="_Toc186050674"/>
       <w:r>
         <w:t>Terminology</w:t>
       </w:r>
+      <w:bookmarkEnd w:id="1"/>
     </w:p>
     <w:tbl>
       <w:tblPr>
@@ -1287,18 +1561,691 @@
           </w:p>
         </w:tc>
       </w:tr>
+      <w:tr>
+        <w:tc>
+          <w:tcPr>
+            <w:tcW w:w="2972" w:type="dxa"/>
+          </w:tcPr>
+          <w:p>
+            <w:pPr>
+              <w:jc w:val="center"/>
+            </w:pPr>
+            <w:r>
+              <w:t>World</w:t>
+            </w:r>
+          </w:p>
+        </w:tc>
+        <w:tc>
+          <w:tcPr>
+            <w:tcW w:w="6378" w:type="dxa"/>
+          </w:tcPr>
+          <w:p>
+            <w:r>
+              <w:t>A collection of levels unified by a single theme or plot point.</w:t>
+            </w:r>
+          </w:p>
+        </w:tc>
+      </w:tr>
+      <w:tr>
+        <w:trPr>
+          <w:cnfStyle w:val="000000100000" w:firstRow="0" w:lastRow="0" w:firstColumn="0" w:lastColumn="0" w:oddVBand="0" w:evenVBand="0" w:oddHBand="1" w:evenHBand="0" w:firstRowFirstColumn="0" w:firstRowLastColumn="0" w:lastRowFirstColumn="0" w:lastRowLastColumn="0"/>
+        </w:trPr>
+        <w:tc>
+          <w:tcPr>
+            <w:tcW w:w="2972" w:type="dxa"/>
+          </w:tcPr>
+          <w:p>
+            <w:pPr>
+              <w:jc w:val="center"/>
+            </w:pPr>
+            <w:r>
+              <w:t>Tile</w:t>
+            </w:r>
+          </w:p>
+        </w:tc>
+        <w:tc>
+          <w:tcPr>
+            <w:tcW w:w="6378" w:type="dxa"/>
+          </w:tcPr>
+          <w:p>
+            <w:r>
+              <w:t>A single hexagonal on the hexagonal grid which makes up the map.</w:t>
+            </w:r>
+          </w:p>
+        </w:tc>
+      </w:tr>
+      <w:tr>
+        <w:tc>
+          <w:tcPr>
+            <w:tcW w:w="2972" w:type="dxa"/>
+          </w:tcPr>
+          <w:p>
+            <w:pPr>
+              <w:jc w:val="center"/>
+            </w:pPr>
+            <w:r>
+              <w:t>Towers</w:t>
+            </w:r>
+          </w:p>
+        </w:tc>
+        <w:tc>
+          <w:tcPr>
+            <w:tcW w:w="6378" w:type="dxa"/>
+          </w:tcPr>
+          <w:p>
+            <w:r>
+              <w:t>Units which defend against attackers.</w:t>
+            </w:r>
+          </w:p>
+        </w:tc>
+      </w:tr>
+      <w:tr>
+        <w:trPr>
+          <w:cnfStyle w:val="000000100000" w:firstRow="0" w:lastRow="0" w:firstColumn="0" w:lastColumn="0" w:oddVBand="0" w:evenVBand="0" w:oddHBand="1" w:evenHBand="0" w:firstRowFirstColumn="0" w:firstRowLastColumn="0" w:lastRowFirstColumn="0" w:lastRowLastColumn="0"/>
+        </w:trPr>
+        <w:tc>
+          <w:tcPr>
+            <w:tcW w:w="2972" w:type="dxa"/>
+          </w:tcPr>
+          <w:p>
+            <w:pPr>
+              <w:jc w:val="center"/>
+            </w:pPr>
+            <w:r>
+              <w:t>Pregame</w:t>
+            </w:r>
+          </w:p>
+        </w:tc>
+        <w:tc>
+          <w:tcPr>
+            <w:tcW w:w="6378" w:type="dxa"/>
+          </w:tcPr>
+          <w:p>
+            <w:r>
+              <w:t>The period between starting a level and before starting the first wave.</w:t>
+            </w:r>
+          </w:p>
+        </w:tc>
+      </w:tr>
+      <w:tr>
+        <w:tc>
+          <w:tcPr>
+            <w:tcW w:w="2972" w:type="dxa"/>
+          </w:tcPr>
+          <w:p>
+            <w:pPr>
+              <w:jc w:val="center"/>
+            </w:pPr>
+            <w:r>
+              <w:t>Sacred Cat</w:t>
+            </w:r>
+          </w:p>
+        </w:tc>
+        <w:tc>
+          <w:tcPr>
+            <w:tcW w:w="6378" w:type="dxa"/>
+          </w:tcPr>
+          <w:p>
+            <w:r>
+              <w:t>The “heart” of the player’s defences which must be defended at all times!</w:t>
+            </w:r>
+          </w:p>
+        </w:tc>
+      </w:tr>
     </w:tbl>
     <w:p>
       <w:pPr>
         <w:pStyle w:val="Heading1"/>
       </w:pPr>
-      <w:r>
-        <w:t>Game Design</w:t>
+      <w:bookmarkStart w:id="2" w:name="_Toc186050675"/>
+      <w:r>
+        <w:t>Design</w:t>
+      </w:r>
+      <w:bookmarkEnd w:id="2"/>
+    </w:p>
+    <w:p>
+      <w:pPr>
+        <w:pStyle w:val="Heading2"/>
+      </w:pPr>
+      <w:bookmarkStart w:id="3" w:name="_Toc186050676"/>
+      <w:r>
+        <w:t>Overview</w:t>
+      </w:r>
+      <w:bookmarkEnd w:id="3"/>
+    </w:p>
+    <w:p>
+      <w:r>
+        <w:t xml:space="preserve">The basic gameplay loop will consist of </w:t>
+      </w:r>
+      <w:r>
+        <w:t xml:space="preserve">several, escalating waves of enemies attacking the player character’s cat. If the cat </w:t>
+      </w:r>
+      <w:r>
+        <w:t>takes too much damage, it will be roused from its sleep and run away. Cotton and cloth can be harvested to build defences (stuffed animals) which will defend the cat. Defeating enemies will yield XP (experience) which can be used to purchase promotions for your defences.</w:t>
+      </w:r>
+    </w:p>
+    <w:p>
+      <w:pPr>
+        <w:pStyle w:val="Heading2"/>
+      </w:pPr>
+      <w:bookmarkStart w:id="4" w:name="_Toc186050677"/>
+      <w:r>
+        <w:lastRenderedPageBreak/>
+        <w:t>Gameplay</w:t>
+      </w:r>
+      <w:bookmarkEnd w:id="4"/>
+    </w:p>
+    <w:p>
+      <w:pPr>
+        <w:keepNext/>
+      </w:pPr>
+      <w:r>
+        <w:rPr>
+          <w:noProof/>
+        </w:rPr>
+        <w:drawing>
+          <wp:inline distT="0" distB="0" distL="0" distR="0" wp14:anchorId="35FA29AE" wp14:editId="483F0AE9">
+            <wp:extent cx="5943600" cy="3639820"/>
+            <wp:effectExtent l="0" t="0" r="0" b="0"/>
+            <wp:docPr id="1106758189" name="Picture 1" descr="A sketch of the game appearance."/>
+            <wp:cNvGraphicFramePr>
+              <a:graphicFrameLocks xmlns:a="http://schemas.openxmlformats.org/drawingml/2006/main" noChangeAspect="1"/>
+            </wp:cNvGraphicFramePr>
+            <a:graphic xmlns:a="http://schemas.openxmlformats.org/drawingml/2006/main">
+              <a:graphicData uri="http://schemas.openxmlformats.org/drawingml/2006/picture">
+                <pic:pic xmlns:pic="http://schemas.openxmlformats.org/drawingml/2006/picture">
+                  <pic:nvPicPr>
+                    <pic:cNvPr id="1106758189" name="Picture 1" descr="A sketch of the game appearance."/>
+                    <pic:cNvPicPr/>
+                  </pic:nvPicPr>
+                  <pic:blipFill>
+                    <a:blip r:embed="rId7"/>
+                    <a:stretch>
+                      <a:fillRect/>
+                    </a:stretch>
+                  </pic:blipFill>
+                  <pic:spPr>
+                    <a:xfrm>
+                      <a:off x="0" y="0"/>
+                      <a:ext cx="5943600" cy="3639820"/>
+                    </a:xfrm>
+                    <a:prstGeom prst="rect">
+                      <a:avLst/>
+                    </a:prstGeom>
+                  </pic:spPr>
+                </pic:pic>
+              </a:graphicData>
+            </a:graphic>
+          </wp:inline>
+        </w:drawing>
+      </w:r>
+    </w:p>
+    <w:p>
+      <w:pPr>
+        <w:pStyle w:val="Caption"/>
+        <w:jc w:val="center"/>
+      </w:pPr>
+      <w:bookmarkStart w:id="5" w:name="_Ref186050892"/>
+      <w:r>
+        <w:t xml:space="preserve">Figure </w:t>
+      </w:r>
+      <w:r>
+        <w:fldChar w:fldCharType="begin"/>
+      </w:r>
+      <w:r>
+        <w:instrText xml:space="preserve"> SEQ Figure \* ARABIC </w:instrText>
+      </w:r>
+      <w:r>
+        <w:fldChar w:fldCharType="separate"/>
+      </w:r>
+      <w:r>
+        <w:rPr>
+          <w:noProof/>
+        </w:rPr>
+        <w:t>1</w:t>
+      </w:r>
+      <w:r>
+        <w:fldChar w:fldCharType="end"/>
+      </w:r>
+      <w:bookmarkEnd w:id="5"/>
+      <w:r>
+        <w:t xml:space="preserve"> - Sketch of the gameplay</w:t>
+      </w:r>
+      <w:r>
+        <w:t>.</w:t>
+      </w:r>
+    </w:p>
+    <w:p>
+      <w:r>
+        <w:t>TTD takes place on a grid of hexagonal tiles. Hexagonal tiles can have a variety of attributes:</w:t>
+      </w:r>
+    </w:p>
+    <w:p>
+      <w:pPr>
+        <w:pStyle w:val="ListParagraph"/>
+        <w:numPr>
+          <w:ilvl w:val="0"/>
+          <w:numId w:val="3"/>
+        </w:numPr>
+      </w:pPr>
+      <w:r>
+        <w:t>Elevation</w:t>
+      </w:r>
+      <w:r>
+        <w:t xml:space="preserve"> (float)</w:t>
+      </w:r>
+      <w:r>
+        <w:t xml:space="preserve">: </w:t>
+      </w:r>
+    </w:p>
+    <w:p>
+      <w:pPr>
+        <w:pStyle w:val="ListParagraph"/>
+        <w:numPr>
+          <w:ilvl w:val="1"/>
+          <w:numId w:val="3"/>
+        </w:numPr>
+      </w:pPr>
+      <w:r>
+        <w:t>Tiles can have an elevation from 0-</w:t>
+      </w:r>
+      <w:r>
+        <w:t>3. Tiles which have an elevation difference of greater than or equal to 1 cannot be transversed by standard units</w:t>
+      </w:r>
+      <w:r>
+        <w:t xml:space="preserve"> nor shot over by units </w:t>
+      </w:r>
+      <w:r>
+        <w:t>on the lower tile.</w:t>
+      </w:r>
+    </w:p>
+    <w:p>
+      <w:pPr>
+        <w:pStyle w:val="ListParagraph"/>
+        <w:numPr>
+          <w:ilvl w:val="0"/>
+          <w:numId w:val="3"/>
+        </w:numPr>
+      </w:pPr>
+      <w:r>
+        <w:t>Water (bool):</w:t>
+      </w:r>
+    </w:p>
+    <w:p>
+      <w:pPr>
+        <w:pStyle w:val="ListParagraph"/>
+        <w:numPr>
+          <w:ilvl w:val="1"/>
+          <w:numId w:val="3"/>
+        </w:numPr>
+      </w:pPr>
+      <w:r>
+        <w:t>Tiles may either have or not have water. Tiles with water must be treated differently by enemies while they travel and standard towers cannot be placed on water.</w:t>
+      </w:r>
+    </w:p>
+    <w:p>
+      <w:pPr>
+        <w:pStyle w:val="ListParagraph"/>
+        <w:numPr>
+          <w:ilvl w:val="0"/>
+          <w:numId w:val="3"/>
+        </w:numPr>
+      </w:pPr>
+      <w:r>
+        <w:t xml:space="preserve">Spawnable (bool): </w:t>
+      </w:r>
+    </w:p>
+    <w:p>
+      <w:pPr>
+        <w:pStyle w:val="ListParagraph"/>
+        <w:numPr>
+          <w:ilvl w:val="1"/>
+          <w:numId w:val="3"/>
+        </w:numPr>
+      </w:pPr>
+      <w:r>
+        <w:t>Whether enemies can spawn on these tiles when new waves are summoned.</w:t>
+      </w:r>
+    </w:p>
+    <w:p>
+      <w:r>
+        <w:t>The game will start in</w:t>
+      </w:r>
+      <w:r>
+        <w:t xml:space="preserve"> the pregame.</w:t>
+      </w:r>
+      <w:r>
+        <w:t xml:space="preserve"> During this phase, no enemy waves will spawn until the player clicks the “Start” button (the </w:t>
+      </w:r>
+      <w:r>
+        <w:t>“Start”</w:t>
+      </w:r>
+      <w:r>
+        <w:t xml:space="preserve"> button will occupy the wave counter until the pregame ends). </w:t>
+      </w:r>
+      <w:r>
+        <w:t>The player can use the pregame to do two things:</w:t>
+      </w:r>
+    </w:p>
+    <w:p>
+      <w:pPr>
+        <w:pStyle w:val="ListParagraph"/>
+        <w:numPr>
+          <w:ilvl w:val="0"/>
+          <w:numId w:val="4"/>
+        </w:numPr>
+      </w:pPr>
+      <w:r>
+        <w:t>Place their Sacred Cat</w:t>
+      </w:r>
+      <w:r>
+        <w:t xml:space="preserve"> on a viable tile (mandatory).</w:t>
+      </w:r>
+    </w:p>
+    <w:p>
+      <w:pPr>
+        <w:pStyle w:val="ListParagraph"/>
+        <w:numPr>
+          <w:ilvl w:val="0"/>
+          <w:numId w:val="4"/>
+        </w:numPr>
+      </w:pPr>
+      <w:r>
+        <w:t>Place defensive towers (optional).</w:t>
+      </w:r>
+    </w:p>
+    <w:p>
+      <w:r>
+        <w:t xml:space="preserve">Four stats/”currencies” are present in the top corner. </w:t>
+      </w:r>
+    </w:p>
+    <w:p>
+      <w:pPr>
+        <w:pStyle w:val="ListParagraph"/>
+        <w:numPr>
+          <w:ilvl w:val="0"/>
+          <w:numId w:val="5"/>
+        </w:numPr>
+      </w:pPr>
+      <w:r>
+        <w:t>Health: How many hit points the Sacred Cat has remaining. When health reaches zero, the player loses the game.</w:t>
+      </w:r>
+    </w:p>
+    <w:p>
+      <w:pPr>
+        <w:pStyle w:val="ListParagraph"/>
+        <w:numPr>
+          <w:ilvl w:val="0"/>
+          <w:numId w:val="5"/>
+        </w:numPr>
+      </w:pPr>
+      <w:r>
+        <w:lastRenderedPageBreak/>
+        <w:t>XP: XP can be used to purchase promotions for units. Killing enemies earns XP.</w:t>
+      </w:r>
+    </w:p>
+    <w:p>
+      <w:pPr>
+        <w:pStyle w:val="ListParagraph"/>
+        <w:numPr>
+          <w:ilvl w:val="0"/>
+          <w:numId w:val="5"/>
+        </w:numPr>
+      </w:pPr>
+      <w:r>
+        <w:t xml:space="preserve">Cloth: </w:t>
+      </w:r>
+      <w:r>
+        <w:t>Cloth is an ingredient used in creating towers. Cloth is harvested by ripping up shirts and furniture.</w:t>
+      </w:r>
+    </w:p>
+    <w:p>
+      <w:pPr>
+        <w:pStyle w:val="ListParagraph"/>
+        <w:numPr>
+          <w:ilvl w:val="0"/>
+          <w:numId w:val="5"/>
+        </w:numPr>
+      </w:pPr>
+      <w:r>
+        <w:t>Cotton</w:t>
+      </w:r>
+      <w:r>
+        <w:t xml:space="preserve">: </w:t>
+      </w:r>
+      <w:r>
+        <w:t>Cotton</w:t>
+      </w:r>
+      <w:r>
+        <w:t xml:space="preserve"> is an ingredient used in creating towers. </w:t>
+      </w:r>
+      <w:r>
+        <w:t>Cotton</w:t>
+      </w:r>
+      <w:r>
+        <w:t xml:space="preserve"> is harvested by ripping up furniture and pillows.</w:t>
+      </w:r>
+    </w:p>
+    <w:p>
+      <w:pPr>
+        <w:pStyle w:val="Heading3"/>
+      </w:pPr>
+      <w:r>
+        <w:t>Towers</w:t>
+      </w:r>
+    </w:p>
+    <w:p>
+      <w:pPr>
+        <w:pStyle w:val="Heading4"/>
+      </w:pPr>
+      <w:r>
+        <w:t>Jeremy</w:t>
+      </w:r>
+    </w:p>
+    <w:p>
+      <w:r>
+        <w:t xml:space="preserve">Jeremy is </w:t>
+      </w:r>
+      <w:r>
+        <w:t>a</w:t>
+      </w:r>
+      <w:r>
+        <w:t xml:space="preserve"> standard tower</w:t>
+      </w:r>
+      <w:r>
+        <w:t>, featuring decent damage and range for an affordable cost</w:t>
+      </w:r>
+      <w:r>
+        <w:t xml:space="preserve">. </w:t>
+      </w:r>
+    </w:p>
+    <w:p>
+      <w:pPr>
+        <w:pStyle w:val="Heading4"/>
+      </w:pPr>
+      <w:r>
+        <w:t>Walter</w:t>
+      </w:r>
+    </w:p>
+    <w:p>
+      <w:r>
+        <w:t>Walter</w:t>
+      </w:r>
+      <w:r>
+        <w:t xml:space="preserve"> is a defensive tower. Despite having minimal damage output, </w:t>
+      </w:r>
+      <w:r>
+        <w:t>Walter</w:t>
+      </w:r>
+      <w:r>
+        <w:t xml:space="preserve"> has an enormous health stat which makes it good for slowing enemy advances.</w:t>
+      </w:r>
+    </w:p>
+    <w:p>
+      <w:pPr>
+        <w:pStyle w:val="Heading4"/>
+      </w:pPr>
+      <w:r>
+        <w:t>Eeyore</w:t>
+      </w:r>
+    </w:p>
+    <w:p>
+      <w:r>
+        <w:t>Eeyore has an accelerated harvesting rate for cloth and cotton. Eeyore has a high damage output but a very small range.</w:t>
+      </w:r>
+    </w:p>
+    <w:p>
+      <w:pPr>
+        <w:pStyle w:val="Heading3"/>
+      </w:pPr>
+      <w:r>
+        <w:t>Enemies</w:t>
+      </w:r>
+    </w:p>
+    <w:p>
+      <w:pPr>
+        <w:pStyle w:val="Heading4"/>
+      </w:pPr>
+      <w:r>
+        <w:t>Dust Bunny (Melee)</w:t>
+      </w:r>
+    </w:p>
+    <w:p>
+      <w:r>
+        <w:t>A fast but weak unit capable of dealing moderate damage at close range.</w:t>
+      </w:r>
+    </w:p>
+    <w:p>
+      <w:pPr>
+        <w:pStyle w:val="Heading4"/>
+      </w:pPr>
+      <w:r>
+        <w:t>Dust Bunny (Ranged)</w:t>
+      </w:r>
+    </w:p>
+    <w:p>
+      <w:r>
+        <w:t>A fast but weak unit capable of dealing light damage at range.</w:t>
+      </w:r>
+    </w:p>
+    <w:p>
+      <w:pPr>
+        <w:pStyle w:val="Heading2"/>
+      </w:pPr>
+      <w:bookmarkStart w:id="6" w:name="_Toc186050678"/>
+      <w:r>
+        <w:t>Game State Flow Chart</w:t>
+      </w:r>
+      <w:bookmarkEnd w:id="6"/>
+    </w:p>
+    <w:p>
+      <w:r>
+        <w:fldChar w:fldCharType="begin"/>
+      </w:r>
+      <w:r>
+        <w:instrText xml:space="preserve"> REF _Ref186037114 \h </w:instrText>
+      </w:r>
+      <w:r>
+        <w:fldChar w:fldCharType="separate"/>
+      </w:r>
+      <w:r>
+        <w:t xml:space="preserve">Figure </w:t>
+      </w:r>
+      <w:r>
+        <w:rPr>
+          <w:noProof/>
+        </w:rPr>
+        <w:t>2</w:t>
+      </w:r>
+      <w:r>
+        <w:fldChar w:fldCharType="end"/>
+      </w:r>
+      <w:r>
+        <w:t xml:space="preserve"> illustrates the different game states and the ways the game changes between those states.</w:t>
+      </w:r>
+    </w:p>
+    <w:p>
+      <w:pPr>
+        <w:keepNext/>
+        <w:jc w:val="center"/>
+      </w:pPr>
+      <w:r>
+        <w:rPr>
+          <w:noProof/>
+        </w:rPr>
+        <w:lastRenderedPageBreak/>
+        <w:drawing>
+          <wp:inline distT="0" distB="0" distL="0" distR="0" wp14:anchorId="3BEEE348" wp14:editId="521A240F">
+            <wp:extent cx="5943600" cy="6348095"/>
+            <wp:effectExtent l="0" t="0" r="0" b="0"/>
+            <wp:docPr id="1485945802" name="Picture 1" descr="Tofu Tower Defence screens"/>
+            <wp:cNvGraphicFramePr>
+              <a:graphicFrameLocks xmlns:a="http://schemas.openxmlformats.org/drawingml/2006/main" noChangeAspect="1"/>
+            </wp:cNvGraphicFramePr>
+            <a:graphic xmlns:a="http://schemas.openxmlformats.org/drawingml/2006/main">
+              <a:graphicData uri="http://schemas.openxmlformats.org/drawingml/2006/picture">
+                <pic:pic xmlns:pic="http://schemas.openxmlformats.org/drawingml/2006/picture">
+                  <pic:nvPicPr>
+                    <pic:cNvPr id="1485945802" name="Picture 1" descr="Tofu Tower Defence screens"/>
+                    <pic:cNvPicPr/>
+                  </pic:nvPicPr>
+                  <pic:blipFill>
+                    <a:blip r:embed="rId8"/>
+                    <a:stretch>
+                      <a:fillRect/>
+                    </a:stretch>
+                  </pic:blipFill>
+                  <pic:spPr>
+                    <a:xfrm>
+                      <a:off x="0" y="0"/>
+                      <a:ext cx="5943600" cy="6348095"/>
+                    </a:xfrm>
+                    <a:prstGeom prst="rect">
+                      <a:avLst/>
+                    </a:prstGeom>
+                  </pic:spPr>
+                </pic:pic>
+              </a:graphicData>
+            </a:graphic>
+          </wp:inline>
+        </w:drawing>
+      </w:r>
+    </w:p>
+    <w:p>
+      <w:pPr>
+        <w:pStyle w:val="Caption"/>
+        <w:jc w:val="center"/>
+      </w:pPr>
+      <w:bookmarkStart w:id="7" w:name="_Ref186037114"/>
+      <w:r>
+        <w:t xml:space="preserve">Figure </w:t>
+      </w:r>
+      <w:r>
+        <w:fldChar w:fldCharType="begin"/>
+      </w:r>
+      <w:r>
+        <w:instrText xml:space="preserve"> SEQ Figure \* ARABIC </w:instrText>
+      </w:r>
+      <w:r>
+        <w:fldChar w:fldCharType="separate"/>
+      </w:r>
+      <w:r>
+        <w:rPr>
+          <w:noProof/>
+        </w:rPr>
+        <w:t>2</w:t>
+      </w:r>
+      <w:r>
+        <w:fldChar w:fldCharType="end"/>
+      </w:r>
+      <w:bookmarkEnd w:id="7"/>
+      <w:r>
+        <w:t xml:space="preserve"> - Game state flow chart</w:t>
       </w:r>
     </w:p>
     <w:p/>
     <w:sectPr>
-      <w:footerReference w:type="default" r:id="rId6"/>
+      <w:footerReference w:type="default" r:id="rId9"/>
       <w:pgSz w:w="12240" w:h="15840"/>
       <w:pgMar w:top="1440" w:right="1440" w:bottom="1440" w:left="1440" w:header="720" w:footer="720" w:gutter="0"/>
       <w:pgNumType w:start="0"/>
@@ -1411,6 +2358,564 @@
     </w:p>
   </w:footnote>
 </w:footnotes>
+</file>
+
+<file path=word/numbering.xml><?xml version="1.0" encoding="utf-8"?>
+<w:numbering xmlns:wpc="http://schemas.microsoft.com/office/word/2010/wordprocessingCanvas" xmlns:cx="http://schemas.microsoft.com/office/drawing/2014/chartex" xmlns:cx1="http://schemas.microsoft.com/office/drawing/2015/9/8/chartex" xmlns:cx2="http://schemas.microsoft.com/office/drawing/2015/10/21/chartex" xmlns:cx3="http://schemas.microsoft.com/office/drawing/2016/5/9/chartex" xmlns:cx4="http://schemas.microsoft.com/office/drawing/2016/5/10/chartex" xmlns:cx5="http://schemas.microsoft.com/office/drawing/2016/5/11/chartex" xmlns:cx6="http://schemas.microsoft.com/office/drawing/2016/5/12/chartex" xmlns:cx7="http://schemas.microsoft.com/office/drawing/2016/5/13/chartex" xmlns:cx8="http://schemas.microsoft.com/office/drawing/2016/5/14/chartex" xmlns:mc="http://schemas.openxmlformats.org/markup-compatibility/2006" xmlns:aink="http://schemas.microsoft.com/office/drawing/2016/ink" xmlns:am3d="http://schemas.microsoft.com/office/drawing/2017/model3d" xmlns:o="urn:schemas-microsoft-com:office:office" xmlns:oel="http://schemas.microsoft.com/office/2019/extlst" xmlns:r="http://schemas.openxmlformats.org/officeDocument/2006/relationships" xmlns:m="http://schemas.openxmlformats.org/officeDocument/2006/math" xmlns:v="urn:schemas-microsoft-com:vml" xmlns:wp14="http://schemas.microsoft.com/office/word/2010/wordprocessingDrawing" xmlns:wp="http://schemas.openxmlformats.org/drawingml/2006/wordprocessingDrawing" xmlns:w10="urn:schemas-microsoft-com:office:word" xmlns:w="http://schemas.openxmlformats.org/wordprocessingml/2006/main" xmlns:w14="http://schemas.microsoft.com/office/word/2010/wordml" xmlns:w15="http://schemas.microsoft.com/office/word/2012/wordml" xmlns:w16cex="http://schemas.microsoft.com/office/word/2018/wordml/cex" xmlns:w16cid="http://schemas.microsoft.com/office/word/2016/wordml/cid" xmlns:w16="http://schemas.microsoft.com/office/word/2018/wordml" xmlns:w16du="http://schemas.microsoft.com/office/word/2023/wordml/word16du" xmlns:w16sdtdh="http://schemas.microsoft.com/office/word/2020/wordml/sdtdatahash" xmlns:w16se="http://schemas.microsoft.com/office/word/2015/wordml/symex" xmlns:wpg="http://schemas.microsoft.com/office/word/2010/wordprocessingGroup" xmlns:wpi="http://schemas.microsoft.com/office/word/2010/wordprocessingInk" xmlns:wne="http://schemas.microsoft.com/office/word/2006/wordml" xmlns:wps="http://schemas.microsoft.com/office/word/2010/wordprocessingShape" mc:Ignorable="w14 w15 w16se w16cid w16 w16cex w16sdtdh w16du wp14">
+  <w:abstractNum w:abstractNumId="0" w15:restartNumberingAfterBreak="0">
+    <w:nsid w:val="288D5F31"/>
+    <w:multiLevelType w:val="hybridMultilevel"/>
+    <w:tmpl w:val="399EC0E0"/>
+    <w:lvl w:ilvl="0" w:tplc="0409000F">
+      <w:start w:val="1"/>
+      <w:numFmt w:val="decimal"/>
+      <w:lvlText w:val="%1."/>
+      <w:lvlJc w:val="left"/>
+      <w:pPr>
+        <w:ind w:left="720" w:hanging="360"/>
+      </w:pPr>
+    </w:lvl>
+    <w:lvl w:ilvl="1" w:tplc="04090019" w:tentative="1">
+      <w:start w:val="1"/>
+      <w:numFmt w:val="lowerLetter"/>
+      <w:lvlText w:val="%2."/>
+      <w:lvlJc w:val="left"/>
+      <w:pPr>
+        <w:ind w:left="1440" w:hanging="360"/>
+      </w:pPr>
+    </w:lvl>
+    <w:lvl w:ilvl="2" w:tplc="0409001B" w:tentative="1">
+      <w:start w:val="1"/>
+      <w:numFmt w:val="lowerRoman"/>
+      <w:lvlText w:val="%3."/>
+      <w:lvlJc w:val="right"/>
+      <w:pPr>
+        <w:ind w:left="2160" w:hanging="180"/>
+      </w:pPr>
+    </w:lvl>
+    <w:lvl w:ilvl="3" w:tplc="0409000F" w:tentative="1">
+      <w:start w:val="1"/>
+      <w:numFmt w:val="decimal"/>
+      <w:lvlText w:val="%4."/>
+      <w:lvlJc w:val="left"/>
+      <w:pPr>
+        <w:ind w:left="2880" w:hanging="360"/>
+      </w:pPr>
+    </w:lvl>
+    <w:lvl w:ilvl="4" w:tplc="04090019" w:tentative="1">
+      <w:start w:val="1"/>
+      <w:numFmt w:val="lowerLetter"/>
+      <w:lvlText w:val="%5."/>
+      <w:lvlJc w:val="left"/>
+      <w:pPr>
+        <w:ind w:left="3600" w:hanging="360"/>
+      </w:pPr>
+    </w:lvl>
+    <w:lvl w:ilvl="5" w:tplc="0409001B" w:tentative="1">
+      <w:start w:val="1"/>
+      <w:numFmt w:val="lowerRoman"/>
+      <w:lvlText w:val="%6."/>
+      <w:lvlJc w:val="right"/>
+      <w:pPr>
+        <w:ind w:left="4320" w:hanging="180"/>
+      </w:pPr>
+    </w:lvl>
+    <w:lvl w:ilvl="6" w:tplc="0409000F" w:tentative="1">
+      <w:start w:val="1"/>
+      <w:numFmt w:val="decimal"/>
+      <w:lvlText w:val="%7."/>
+      <w:lvlJc w:val="left"/>
+      <w:pPr>
+        <w:ind w:left="5040" w:hanging="360"/>
+      </w:pPr>
+    </w:lvl>
+    <w:lvl w:ilvl="7" w:tplc="04090019" w:tentative="1">
+      <w:start w:val="1"/>
+      <w:numFmt w:val="lowerLetter"/>
+      <w:lvlText w:val="%8."/>
+      <w:lvlJc w:val="left"/>
+      <w:pPr>
+        <w:ind w:left="5760" w:hanging="360"/>
+      </w:pPr>
+    </w:lvl>
+    <w:lvl w:ilvl="8" w:tplc="0409001B" w:tentative="1">
+      <w:start w:val="1"/>
+      <w:numFmt w:val="lowerRoman"/>
+      <w:lvlText w:val="%9."/>
+      <w:lvlJc w:val="right"/>
+      <w:pPr>
+        <w:ind w:left="6480" w:hanging="180"/>
+      </w:pPr>
+    </w:lvl>
+  </w:abstractNum>
+  <w:abstractNum w:abstractNumId="1" w15:restartNumberingAfterBreak="0">
+    <w:nsid w:val="2A7461C9"/>
+    <w:multiLevelType w:val="hybridMultilevel"/>
+    <w:tmpl w:val="451002AE"/>
+    <w:lvl w:ilvl="0" w:tplc="04090001">
+      <w:start w:val="1"/>
+      <w:numFmt w:val="bullet"/>
+      <w:lvlText w:val=""/>
+      <w:lvlJc w:val="left"/>
+      <w:pPr>
+        <w:ind w:left="720" w:hanging="360"/>
+      </w:pPr>
+      <w:rPr>
+        <w:rFonts w:ascii="Symbol" w:hAnsi="Symbol" w:hint="default"/>
+      </w:rPr>
+    </w:lvl>
+    <w:lvl w:ilvl="1" w:tplc="04090003" w:tentative="1">
+      <w:start w:val="1"/>
+      <w:numFmt w:val="bullet"/>
+      <w:lvlText w:val="o"/>
+      <w:lvlJc w:val="left"/>
+      <w:pPr>
+        <w:ind w:left="1440" w:hanging="360"/>
+      </w:pPr>
+      <w:rPr>
+        <w:rFonts w:ascii="Courier New" w:hAnsi="Courier New" w:cs="Courier New" w:hint="default"/>
+      </w:rPr>
+    </w:lvl>
+    <w:lvl w:ilvl="2" w:tplc="04090005" w:tentative="1">
+      <w:start w:val="1"/>
+      <w:numFmt w:val="bullet"/>
+      <w:lvlText w:val=""/>
+      <w:lvlJc w:val="left"/>
+      <w:pPr>
+        <w:ind w:left="2160" w:hanging="360"/>
+      </w:pPr>
+      <w:rPr>
+        <w:rFonts w:ascii="Wingdings" w:hAnsi="Wingdings" w:hint="default"/>
+      </w:rPr>
+    </w:lvl>
+    <w:lvl w:ilvl="3" w:tplc="04090001" w:tentative="1">
+      <w:start w:val="1"/>
+      <w:numFmt w:val="bullet"/>
+      <w:lvlText w:val=""/>
+      <w:lvlJc w:val="left"/>
+      <w:pPr>
+        <w:ind w:left="2880" w:hanging="360"/>
+      </w:pPr>
+      <w:rPr>
+        <w:rFonts w:ascii="Symbol" w:hAnsi="Symbol" w:hint="default"/>
+      </w:rPr>
+    </w:lvl>
+    <w:lvl w:ilvl="4" w:tplc="04090003" w:tentative="1">
+      <w:start w:val="1"/>
+      <w:numFmt w:val="bullet"/>
+      <w:lvlText w:val="o"/>
+      <w:lvlJc w:val="left"/>
+      <w:pPr>
+        <w:ind w:left="3600" w:hanging="360"/>
+      </w:pPr>
+      <w:rPr>
+        <w:rFonts w:ascii="Courier New" w:hAnsi="Courier New" w:cs="Courier New" w:hint="default"/>
+      </w:rPr>
+    </w:lvl>
+    <w:lvl w:ilvl="5" w:tplc="04090005" w:tentative="1">
+      <w:start w:val="1"/>
+      <w:numFmt w:val="bullet"/>
+      <w:lvlText w:val=""/>
+      <w:lvlJc w:val="left"/>
+      <w:pPr>
+        <w:ind w:left="4320" w:hanging="360"/>
+      </w:pPr>
+      <w:rPr>
+        <w:rFonts w:ascii="Wingdings" w:hAnsi="Wingdings" w:hint="default"/>
+      </w:rPr>
+    </w:lvl>
+    <w:lvl w:ilvl="6" w:tplc="04090001" w:tentative="1">
+      <w:start w:val="1"/>
+      <w:numFmt w:val="bullet"/>
+      <w:lvlText w:val=""/>
+      <w:lvlJc w:val="left"/>
+      <w:pPr>
+        <w:ind w:left="5040" w:hanging="360"/>
+      </w:pPr>
+      <w:rPr>
+        <w:rFonts w:ascii="Symbol" w:hAnsi="Symbol" w:hint="default"/>
+      </w:rPr>
+    </w:lvl>
+    <w:lvl w:ilvl="7" w:tplc="04090003" w:tentative="1">
+      <w:start w:val="1"/>
+      <w:numFmt w:val="bullet"/>
+      <w:lvlText w:val="o"/>
+      <w:lvlJc w:val="left"/>
+      <w:pPr>
+        <w:ind w:left="5760" w:hanging="360"/>
+      </w:pPr>
+      <w:rPr>
+        <w:rFonts w:ascii="Courier New" w:hAnsi="Courier New" w:cs="Courier New" w:hint="default"/>
+      </w:rPr>
+    </w:lvl>
+    <w:lvl w:ilvl="8" w:tplc="04090005" w:tentative="1">
+      <w:start w:val="1"/>
+      <w:numFmt w:val="bullet"/>
+      <w:lvlText w:val=""/>
+      <w:lvlJc w:val="left"/>
+      <w:pPr>
+        <w:ind w:left="6480" w:hanging="360"/>
+      </w:pPr>
+      <w:rPr>
+        <w:rFonts w:ascii="Wingdings" w:hAnsi="Wingdings" w:hint="default"/>
+      </w:rPr>
+    </w:lvl>
+  </w:abstractNum>
+  <w:abstractNum w:abstractNumId="2" w15:restartNumberingAfterBreak="0">
+    <w:nsid w:val="30671143"/>
+    <w:multiLevelType w:val="hybridMultilevel"/>
+    <w:tmpl w:val="B68CC45E"/>
+    <w:lvl w:ilvl="0" w:tplc="04090001">
+      <w:start w:val="1"/>
+      <w:numFmt w:val="bullet"/>
+      <w:lvlText w:val=""/>
+      <w:lvlJc w:val="left"/>
+      <w:pPr>
+        <w:ind w:left="720" w:hanging="360"/>
+      </w:pPr>
+      <w:rPr>
+        <w:rFonts w:ascii="Symbol" w:hAnsi="Symbol" w:hint="default"/>
+      </w:rPr>
+    </w:lvl>
+    <w:lvl w:ilvl="1" w:tplc="04090003" w:tentative="1">
+      <w:start w:val="1"/>
+      <w:numFmt w:val="bullet"/>
+      <w:lvlText w:val="o"/>
+      <w:lvlJc w:val="left"/>
+      <w:pPr>
+        <w:ind w:left="1440" w:hanging="360"/>
+      </w:pPr>
+      <w:rPr>
+        <w:rFonts w:ascii="Courier New" w:hAnsi="Courier New" w:cs="Courier New" w:hint="default"/>
+      </w:rPr>
+    </w:lvl>
+    <w:lvl w:ilvl="2" w:tplc="04090005" w:tentative="1">
+      <w:start w:val="1"/>
+      <w:numFmt w:val="bullet"/>
+      <w:lvlText w:val=""/>
+      <w:lvlJc w:val="left"/>
+      <w:pPr>
+        <w:ind w:left="2160" w:hanging="360"/>
+      </w:pPr>
+      <w:rPr>
+        <w:rFonts w:ascii="Wingdings" w:hAnsi="Wingdings" w:hint="default"/>
+      </w:rPr>
+    </w:lvl>
+    <w:lvl w:ilvl="3" w:tplc="04090001" w:tentative="1">
+      <w:start w:val="1"/>
+      <w:numFmt w:val="bullet"/>
+      <w:lvlText w:val=""/>
+      <w:lvlJc w:val="left"/>
+      <w:pPr>
+        <w:ind w:left="2880" w:hanging="360"/>
+      </w:pPr>
+      <w:rPr>
+        <w:rFonts w:ascii="Symbol" w:hAnsi="Symbol" w:hint="default"/>
+      </w:rPr>
+    </w:lvl>
+    <w:lvl w:ilvl="4" w:tplc="04090003" w:tentative="1">
+      <w:start w:val="1"/>
+      <w:numFmt w:val="bullet"/>
+      <w:lvlText w:val="o"/>
+      <w:lvlJc w:val="left"/>
+      <w:pPr>
+        <w:ind w:left="3600" w:hanging="360"/>
+      </w:pPr>
+      <w:rPr>
+        <w:rFonts w:ascii="Courier New" w:hAnsi="Courier New" w:cs="Courier New" w:hint="default"/>
+      </w:rPr>
+    </w:lvl>
+    <w:lvl w:ilvl="5" w:tplc="04090005" w:tentative="1">
+      <w:start w:val="1"/>
+      <w:numFmt w:val="bullet"/>
+      <w:lvlText w:val=""/>
+      <w:lvlJc w:val="left"/>
+      <w:pPr>
+        <w:ind w:left="4320" w:hanging="360"/>
+      </w:pPr>
+      <w:rPr>
+        <w:rFonts w:ascii="Wingdings" w:hAnsi="Wingdings" w:hint="default"/>
+      </w:rPr>
+    </w:lvl>
+    <w:lvl w:ilvl="6" w:tplc="04090001" w:tentative="1">
+      <w:start w:val="1"/>
+      <w:numFmt w:val="bullet"/>
+      <w:lvlText w:val=""/>
+      <w:lvlJc w:val="left"/>
+      <w:pPr>
+        <w:ind w:left="5040" w:hanging="360"/>
+      </w:pPr>
+      <w:rPr>
+        <w:rFonts w:ascii="Symbol" w:hAnsi="Symbol" w:hint="default"/>
+      </w:rPr>
+    </w:lvl>
+    <w:lvl w:ilvl="7" w:tplc="04090003" w:tentative="1">
+      <w:start w:val="1"/>
+      <w:numFmt w:val="bullet"/>
+      <w:lvlText w:val="o"/>
+      <w:lvlJc w:val="left"/>
+      <w:pPr>
+        <w:ind w:left="5760" w:hanging="360"/>
+      </w:pPr>
+      <w:rPr>
+        <w:rFonts w:ascii="Courier New" w:hAnsi="Courier New" w:cs="Courier New" w:hint="default"/>
+      </w:rPr>
+    </w:lvl>
+    <w:lvl w:ilvl="8" w:tplc="04090005" w:tentative="1">
+      <w:start w:val="1"/>
+      <w:numFmt w:val="bullet"/>
+      <w:lvlText w:val=""/>
+      <w:lvlJc w:val="left"/>
+      <w:pPr>
+        <w:ind w:left="6480" w:hanging="360"/>
+      </w:pPr>
+      <w:rPr>
+        <w:rFonts w:ascii="Wingdings" w:hAnsi="Wingdings" w:hint="default"/>
+      </w:rPr>
+    </w:lvl>
+  </w:abstractNum>
+  <w:abstractNum w:abstractNumId="3" w15:restartNumberingAfterBreak="0">
+    <w:nsid w:val="48D37795"/>
+    <w:multiLevelType w:val="hybridMultilevel"/>
+    <w:tmpl w:val="B096E2D2"/>
+    <w:lvl w:ilvl="0" w:tplc="04090001">
+      <w:start w:val="1"/>
+      <w:numFmt w:val="bullet"/>
+      <w:lvlText w:val=""/>
+      <w:lvlJc w:val="left"/>
+      <w:pPr>
+        <w:ind w:left="720" w:hanging="360"/>
+      </w:pPr>
+      <w:rPr>
+        <w:rFonts w:ascii="Symbol" w:hAnsi="Symbol" w:hint="default"/>
+      </w:rPr>
+    </w:lvl>
+    <w:lvl w:ilvl="1" w:tplc="04090003" w:tentative="1">
+      <w:start w:val="1"/>
+      <w:numFmt w:val="bullet"/>
+      <w:lvlText w:val="o"/>
+      <w:lvlJc w:val="left"/>
+      <w:pPr>
+        <w:ind w:left="1440" w:hanging="360"/>
+      </w:pPr>
+      <w:rPr>
+        <w:rFonts w:ascii="Courier New" w:hAnsi="Courier New" w:cs="Courier New" w:hint="default"/>
+      </w:rPr>
+    </w:lvl>
+    <w:lvl w:ilvl="2" w:tplc="04090005" w:tentative="1">
+      <w:start w:val="1"/>
+      <w:numFmt w:val="bullet"/>
+      <w:lvlText w:val=""/>
+      <w:lvlJc w:val="left"/>
+      <w:pPr>
+        <w:ind w:left="2160" w:hanging="360"/>
+      </w:pPr>
+      <w:rPr>
+        <w:rFonts w:ascii="Wingdings" w:hAnsi="Wingdings" w:hint="default"/>
+      </w:rPr>
+    </w:lvl>
+    <w:lvl w:ilvl="3" w:tplc="04090001" w:tentative="1">
+      <w:start w:val="1"/>
+      <w:numFmt w:val="bullet"/>
+      <w:lvlText w:val=""/>
+      <w:lvlJc w:val="left"/>
+      <w:pPr>
+        <w:ind w:left="2880" w:hanging="360"/>
+      </w:pPr>
+      <w:rPr>
+        <w:rFonts w:ascii="Symbol" w:hAnsi="Symbol" w:hint="default"/>
+      </w:rPr>
+    </w:lvl>
+    <w:lvl w:ilvl="4" w:tplc="04090003" w:tentative="1">
+      <w:start w:val="1"/>
+      <w:numFmt w:val="bullet"/>
+      <w:lvlText w:val="o"/>
+      <w:lvlJc w:val="left"/>
+      <w:pPr>
+        <w:ind w:left="3600" w:hanging="360"/>
+      </w:pPr>
+      <w:rPr>
+        <w:rFonts w:ascii="Courier New" w:hAnsi="Courier New" w:cs="Courier New" w:hint="default"/>
+      </w:rPr>
+    </w:lvl>
+    <w:lvl w:ilvl="5" w:tplc="04090005" w:tentative="1">
+      <w:start w:val="1"/>
+      <w:numFmt w:val="bullet"/>
+      <w:lvlText w:val=""/>
+      <w:lvlJc w:val="left"/>
+      <w:pPr>
+        <w:ind w:left="4320" w:hanging="360"/>
+      </w:pPr>
+      <w:rPr>
+        <w:rFonts w:ascii="Wingdings" w:hAnsi="Wingdings" w:hint="default"/>
+      </w:rPr>
+    </w:lvl>
+    <w:lvl w:ilvl="6" w:tplc="04090001" w:tentative="1">
+      <w:start w:val="1"/>
+      <w:numFmt w:val="bullet"/>
+      <w:lvlText w:val=""/>
+      <w:lvlJc w:val="left"/>
+      <w:pPr>
+        <w:ind w:left="5040" w:hanging="360"/>
+      </w:pPr>
+      <w:rPr>
+        <w:rFonts w:ascii="Symbol" w:hAnsi="Symbol" w:hint="default"/>
+      </w:rPr>
+    </w:lvl>
+    <w:lvl w:ilvl="7" w:tplc="04090003" w:tentative="1">
+      <w:start w:val="1"/>
+      <w:numFmt w:val="bullet"/>
+      <w:lvlText w:val="o"/>
+      <w:lvlJc w:val="left"/>
+      <w:pPr>
+        <w:ind w:left="5760" w:hanging="360"/>
+      </w:pPr>
+      <w:rPr>
+        <w:rFonts w:ascii="Courier New" w:hAnsi="Courier New" w:cs="Courier New" w:hint="default"/>
+      </w:rPr>
+    </w:lvl>
+    <w:lvl w:ilvl="8" w:tplc="04090005" w:tentative="1">
+      <w:start w:val="1"/>
+      <w:numFmt w:val="bullet"/>
+      <w:lvlText w:val=""/>
+      <w:lvlJc w:val="left"/>
+      <w:pPr>
+        <w:ind w:left="6480" w:hanging="360"/>
+      </w:pPr>
+      <w:rPr>
+        <w:rFonts w:ascii="Wingdings" w:hAnsi="Wingdings" w:hint="default"/>
+      </w:rPr>
+    </w:lvl>
+  </w:abstractNum>
+  <w:abstractNum w:abstractNumId="4" w15:restartNumberingAfterBreak="0">
+    <w:nsid w:val="50B75378"/>
+    <w:multiLevelType w:val="hybridMultilevel"/>
+    <w:tmpl w:val="B0568864"/>
+    <w:lvl w:ilvl="0" w:tplc="04090001">
+      <w:start w:val="1"/>
+      <w:numFmt w:val="bullet"/>
+      <w:lvlText w:val=""/>
+      <w:lvlJc w:val="left"/>
+      <w:pPr>
+        <w:ind w:left="720" w:hanging="360"/>
+      </w:pPr>
+      <w:rPr>
+        <w:rFonts w:ascii="Symbol" w:hAnsi="Symbol" w:hint="default"/>
+      </w:rPr>
+    </w:lvl>
+    <w:lvl w:ilvl="1" w:tplc="04090001">
+      <w:start w:val="1"/>
+      <w:numFmt w:val="bullet"/>
+      <w:lvlText w:val=""/>
+      <w:lvlJc w:val="left"/>
+      <w:pPr>
+        <w:ind w:left="1440" w:hanging="360"/>
+      </w:pPr>
+      <w:rPr>
+        <w:rFonts w:ascii="Symbol" w:hAnsi="Symbol" w:hint="default"/>
+      </w:rPr>
+    </w:lvl>
+    <w:lvl w:ilvl="2" w:tplc="04090005" w:tentative="1">
+      <w:start w:val="1"/>
+      <w:numFmt w:val="bullet"/>
+      <w:lvlText w:val=""/>
+      <w:lvlJc w:val="left"/>
+      <w:pPr>
+        <w:ind w:left="2160" w:hanging="360"/>
+      </w:pPr>
+      <w:rPr>
+        <w:rFonts w:ascii="Wingdings" w:hAnsi="Wingdings" w:hint="default"/>
+      </w:rPr>
+    </w:lvl>
+    <w:lvl w:ilvl="3" w:tplc="04090001" w:tentative="1">
+      <w:start w:val="1"/>
+      <w:numFmt w:val="bullet"/>
+      <w:lvlText w:val=""/>
+      <w:lvlJc w:val="left"/>
+      <w:pPr>
+        <w:ind w:left="2880" w:hanging="360"/>
+      </w:pPr>
+      <w:rPr>
+        <w:rFonts w:ascii="Symbol" w:hAnsi="Symbol" w:hint="default"/>
+      </w:rPr>
+    </w:lvl>
+    <w:lvl w:ilvl="4" w:tplc="04090003" w:tentative="1">
+      <w:start w:val="1"/>
+      <w:numFmt w:val="bullet"/>
+      <w:lvlText w:val="o"/>
+      <w:lvlJc w:val="left"/>
+      <w:pPr>
+        <w:ind w:left="3600" w:hanging="360"/>
+      </w:pPr>
+      <w:rPr>
+        <w:rFonts w:ascii="Courier New" w:hAnsi="Courier New" w:cs="Courier New" w:hint="default"/>
+      </w:rPr>
+    </w:lvl>
+    <w:lvl w:ilvl="5" w:tplc="04090005" w:tentative="1">
+      <w:start w:val="1"/>
+      <w:numFmt w:val="bullet"/>
+      <w:lvlText w:val=""/>
+      <w:lvlJc w:val="left"/>
+      <w:pPr>
+        <w:ind w:left="4320" w:hanging="360"/>
+      </w:pPr>
+      <w:rPr>
+        <w:rFonts w:ascii="Wingdings" w:hAnsi="Wingdings" w:hint="default"/>
+      </w:rPr>
+    </w:lvl>
+    <w:lvl w:ilvl="6" w:tplc="04090001" w:tentative="1">
+      <w:start w:val="1"/>
+      <w:numFmt w:val="bullet"/>
+      <w:lvlText w:val=""/>
+      <w:lvlJc w:val="left"/>
+      <w:pPr>
+        <w:ind w:left="5040" w:hanging="360"/>
+      </w:pPr>
+      <w:rPr>
+        <w:rFonts w:ascii="Symbol" w:hAnsi="Symbol" w:hint="default"/>
+      </w:rPr>
+    </w:lvl>
+    <w:lvl w:ilvl="7" w:tplc="04090003" w:tentative="1">
+      <w:start w:val="1"/>
+      <w:numFmt w:val="bullet"/>
+      <w:lvlText w:val="o"/>
+      <w:lvlJc w:val="left"/>
+      <w:pPr>
+        <w:ind w:left="5760" w:hanging="360"/>
+      </w:pPr>
+      <w:rPr>
+        <w:rFonts w:ascii="Courier New" w:hAnsi="Courier New" w:cs="Courier New" w:hint="default"/>
+      </w:rPr>
+    </w:lvl>
+    <w:lvl w:ilvl="8" w:tplc="04090005" w:tentative="1">
+      <w:start w:val="1"/>
+      <w:numFmt w:val="bullet"/>
+      <w:lvlText w:val=""/>
+      <w:lvlJc w:val="left"/>
+      <w:pPr>
+        <w:ind w:left="6480" w:hanging="360"/>
+      </w:pPr>
+      <w:rPr>
+        <w:rFonts w:ascii="Wingdings" w:hAnsi="Wingdings" w:hint="default"/>
+      </w:rPr>
+    </w:lvl>
+  </w:abstractNum>
+  <w:num w:numId="1" w16cid:durableId="653870819">
+    <w:abstractNumId w:val="1"/>
+  </w:num>
+  <w:num w:numId="2" w16cid:durableId="1842037635">
+    <w:abstractNumId w:val="3"/>
+  </w:num>
+  <w:num w:numId="3" w16cid:durableId="1041435997">
+    <w:abstractNumId w:val="4"/>
+  </w:num>
+  <w:num w:numId="4" w16cid:durableId="1652831045">
+    <w:abstractNumId w:val="0"/>
+  </w:num>
+  <w:num w:numId="5" w16cid:durableId="1562208664">
+    <w:abstractNumId w:val="2"/>
+  </w:num>
+</w:numbering>
 </file>
 
 <file path=word/styles.xml><?xml version="1.0" encoding="utf-8"?>
@@ -1868,7 +3373,6 @@
     <w:next w:val="Normal"/>
     <w:link w:val="Heading3Char"/>
     <w:uiPriority w:val="9"/>
-    <w:semiHidden/>
     <w:unhideWhenUsed/>
     <w:qFormat/>
     <w:rsid w:val="00EF1145"/>
@@ -1891,7 +3395,6 @@
     <w:next w:val="Normal"/>
     <w:link w:val="Heading4Char"/>
     <w:uiPriority w:val="9"/>
-    <w:semiHidden/>
     <w:unhideWhenUsed/>
     <w:qFormat/>
     <w:rsid w:val="00E567DD"/>
@@ -2160,7 +3663,6 @@
     <w:basedOn w:val="DefaultParagraphFont"/>
     <w:link w:val="Heading3"/>
     <w:uiPriority w:val="9"/>
-    <w:semiHidden/>
     <w:rsid w:val="00EF1145"/>
     <w:rPr>
       <w:rFonts w:eastAsiaTheme="majorEastAsia" w:cstheme="majorBidi"/>
@@ -2189,7 +3691,6 @@
     <w:basedOn w:val="DefaultParagraphFont"/>
     <w:link w:val="Heading4"/>
     <w:uiPriority w:val="9"/>
-    <w:semiHidden/>
     <w:rsid w:val="00E567DD"/>
     <w:rPr>
       <w:rFonts w:asciiTheme="minorHAnsi" w:eastAsiaTheme="majorEastAsia" w:hAnsiTheme="minorHAnsi" w:cstheme="majorBidi"/>
@@ -2568,6 +4069,38 @@
         <w:shd w:val="clear" w:color="auto" w:fill="CAEDFB" w:themeFill="accent4" w:themeFillTint="33"/>
       </w:tcPr>
     </w:tblStylePr>
+  </w:style>
+  <w:style w:type="paragraph" w:styleId="Caption">
+    <w:name w:val="caption"/>
+    <w:basedOn w:val="Normal"/>
+    <w:next w:val="Normal"/>
+    <w:uiPriority w:val="35"/>
+    <w:unhideWhenUsed/>
+    <w:qFormat/>
+    <w:rsid w:val="000E233E"/>
+    <w:pPr>
+      <w:spacing w:after="200" w:line="240" w:lineRule="auto"/>
+    </w:pPr>
+    <w:rPr>
+      <w:i/>
+      <w:iCs/>
+      <w:color w:val="0E2841" w:themeColor="text2"/>
+      <w:sz w:val="18"/>
+      <w:szCs w:val="18"/>
+    </w:rPr>
+  </w:style>
+  <w:style w:type="paragraph" w:styleId="TOC2">
+    <w:name w:val="toc 2"/>
+    <w:basedOn w:val="Normal"/>
+    <w:next w:val="Normal"/>
+    <w:autoRedefine/>
+    <w:uiPriority w:val="39"/>
+    <w:unhideWhenUsed/>
+    <w:rsid w:val="00FE3376"/>
+    <w:pPr>
+      <w:spacing w:after="100"/>
+      <w:ind w:left="220"/>
+    </w:pPr>
   </w:style>
 </w:styles>
 </file>

</xml_diff>